<commit_message>
feat: validación de contenido en CI, DOCX automático y páginas de impresión por unidad
</commit_message>
<xml_diff>
--- a/docx/01-confianza-real/01-confianza-real.docx
+++ b/docx/01-confianza-real/01-confianza-real.docx
@@ -28,7 +28,7 @@
         </w:p>
       </w:sdtContent>
     </w:sdt>
-    <w:bookmarkStart w:id="17" w:name="confianza-real"/>
+    <w:bookmarkStart w:id="18" w:name="confianza-real"/>
     <w:p>
       <w:pPr>
         <w:pStyle w:val="Heading1"/>
@@ -95,6 +95,41 @@
       </w:r>
       <w:r>
         <w:t xml:space="preserve">→ Ponte en su sitio</w:t>
+      </w:r>
+    </w:p>
+    <w:p>
+      <w:pPr>
+        <w:pStyle w:val="BlockText"/>
+      </w:pPr>
+      <w:r>
+        <w:t xml:space="preserve">🖨️</w:t>
+      </w:r>
+      <w:r>
+        <w:t xml:space="preserve"> </w:t>
+      </w:r>
+      <w:r>
+        <w:rPr>
+          <w:b/>
+          <w:bCs/>
+        </w:rPr>
+        <w:t xml:space="preserve">¿En papel?</w:t>
+      </w:r>
+      <w:r>
+        <w:t xml:space="preserve"> </w:t>
+      </w:r>
+      <w:hyperlink r:id="rId9">
+        <w:r>
+          <w:rPr>
+            <w:rStyle w:val="Hyperlink"/>
+          </w:rPr>
+          <w:t xml:space="preserve">Imprimir unidad completa</w:t>
+        </w:r>
+      </w:hyperlink>
+      <w:r>
+        <w:t xml:space="preserve"> </w:t>
+      </w:r>
+      <w:r>
+        <w:t xml:space="preserve">— índice + todas las fichas, con salto de página.</w:t>
       </w:r>
     </w:p>
     <w:p>
@@ -128,7 +163,7 @@
         </w:pict>
       </w:r>
     </w:p>
-    <w:bookmarkStart w:id="9" w:name="objetivo-de-la-unidad"/>
+    <w:bookmarkStart w:id="10" w:name="objetivo-de-la-unidad"/>
     <w:p>
       <w:pPr>
         <w:pStyle w:val="Heading2"/>
@@ -224,8 +259,8 @@
         </w:pict>
       </w:r>
     </w:p>
-    <w:bookmarkEnd w:id="9"/>
-    <w:bookmarkStart w:id="13" w:name="mapa-de-la-unidad"/>
+    <w:bookmarkEnd w:id="10"/>
+    <w:bookmarkStart w:id="14" w:name="mapa-de-la-unidad"/>
     <w:p>
       <w:pPr>
         <w:pStyle w:val="Heading2"/>
@@ -291,7 +326,7 @@
             <w:pPr>
               <w:pStyle w:val="Compact"/>
             </w:pPr>
-            <w:hyperlink r:id="rId10">
+            <w:hyperlink r:id="rId11">
               <w:r>
                 <w:rPr>
                   <w:rStyle w:val="Hyperlink"/>
@@ -331,7 +366,7 @@
             <w:pPr>
               <w:pStyle w:val="Compact"/>
             </w:pPr>
-            <w:hyperlink r:id="rId11">
+            <w:hyperlink r:id="rId12">
               <w:r>
                 <w:rPr>
                   <w:rStyle w:val="Hyperlink"/>
@@ -371,7 +406,7 @@
             <w:pPr>
               <w:pStyle w:val="Compact"/>
             </w:pPr>
-            <w:hyperlink r:id="rId12">
+            <w:hyperlink r:id="rId13">
               <w:r>
                 <w:rPr>
                   <w:rStyle w:val="Hyperlink"/>
@@ -412,8 +447,8 @@
         </w:pict>
       </w:r>
     </w:p>
-    <w:bookmarkEnd w:id="13"/>
-    <w:bookmarkStart w:id="14" w:name="actividades-y-juegos-de-la-unidad"/>
+    <w:bookmarkEnd w:id="14"/>
+    <w:bookmarkStart w:id="15" w:name="actividades-y-juegos-de-la-unidad"/>
     <w:p>
       <w:pPr>
         <w:pStyle w:val="Heading2"/>
@@ -455,8 +490,8 @@
         </w:pict>
       </w:r>
     </w:p>
-    <w:bookmarkEnd w:id="14"/>
-    <w:bookmarkStart w:id="16" w:name="por-dónde-empiezo"/>
+    <w:bookmarkEnd w:id="15"/>
+    <w:bookmarkStart w:id="17" w:name="por-dónde-empiezo"/>
     <w:p>
       <w:pPr>
         <w:pStyle w:val="Heading2"/>
@@ -479,7 +514,7 @@
       <w:r>
         <w:t xml:space="preserve"> </w:t>
       </w:r>
-      <w:hyperlink r:id="rId10">
+      <w:hyperlink r:id="rId11">
         <w:r>
           <w:rPr>
             <w:rStyle w:val="Hyperlink"/>
@@ -505,7 +540,7 @@
       <w:r>
         <w:t xml:space="preserve"> </w:t>
       </w:r>
-      <w:hyperlink r:id="rId11">
+      <w:hyperlink r:id="rId12">
         <w:r>
           <w:rPr>
             <w:rStyle w:val="Hyperlink"/>
@@ -531,7 +566,7 @@
       <w:r>
         <w:t xml:space="preserve"> </w:t>
       </w:r>
-      <w:hyperlink r:id="rId10">
+      <w:hyperlink r:id="rId11">
         <w:r>
           <w:rPr>
             <w:rStyle w:val="Hyperlink"/>
@@ -558,7 +593,7 @@
         </w:rPr>
         <w:t xml:space="preserve"> </w:t>
       </w:r>
-      <w:hyperlink r:id="rId15">
+      <w:hyperlink r:id="rId16">
         <w:r>
           <w:rPr>
             <w:rStyle w:val="Hyperlink"/>
@@ -576,9 +611,9 @@
         <w:t xml:space="preserve">.</w:t>
       </w:r>
     </w:p>
-    <w:bookmarkEnd w:id="16"/>
     <w:bookmarkEnd w:id="17"/>
-    <w:bookmarkStart w:id="28" w:name="qué-es-la-confianza-real"/>
+    <w:bookmarkEnd w:id="18"/>
+    <w:bookmarkStart w:id="29" w:name="qué-es-la-confianza-real"/>
     <w:p>
       <w:pPr>
         <w:pStyle w:val="Heading1"/>
@@ -642,7 +677,7 @@
         </w:pict>
       </w:r>
     </w:p>
-    <w:bookmarkStart w:id="18" w:name="en-corto"/>
+    <w:bookmarkStart w:id="19" w:name="en-corto"/>
     <w:p>
       <w:pPr>
         <w:pStyle w:val="Heading2"/>
@@ -695,8 +730,8 @@
         </w:pict>
       </w:r>
     </w:p>
-    <w:bookmarkEnd w:id="18"/>
-    <w:bookmarkStart w:id="19" w:name="los-tres-personajes-del-espejo"/>
+    <w:bookmarkEnd w:id="19"/>
+    <w:bookmarkStart w:id="20" w:name="los-tres-personajes-del-espejo"/>
     <w:p>
       <w:pPr>
         <w:pStyle w:val="Heading2"/>
@@ -1115,8 +1150,8 @@
         </w:pict>
       </w:r>
     </w:p>
-    <w:bookmarkEnd w:id="19"/>
-    <w:bookmarkStart w:id="20" w:name="la-autocharla-la-voz-que-te-sabotea"/>
+    <w:bookmarkEnd w:id="20"/>
+    <w:bookmarkStart w:id="21" w:name="la-autocharla-la-voz-que-te-sabotea"/>
     <w:p>
       <w:pPr>
         <w:pStyle w:val="Heading2"/>
@@ -1561,8 +1596,8 @@
         </w:pict>
       </w:r>
     </w:p>
-    <w:bookmarkEnd w:id="20"/>
-    <w:bookmarkStart w:id="21" w:name="el-making-of-vs-el-tráiler"/>
+    <w:bookmarkEnd w:id="21"/>
+    <w:bookmarkStart w:id="22" w:name="el-making-of-vs-el-tráiler"/>
     <w:p>
       <w:pPr>
         <w:pStyle w:val="Heading2"/>
@@ -1741,8 +1776,8 @@
         </w:pict>
       </w:r>
     </w:p>
-    <w:bookmarkEnd w:id="21"/>
-    <w:bookmarkStart w:id="22" w:name="de-dónde-sale-la-confianza-los-4-pilares"/>
+    <w:bookmarkEnd w:id="22"/>
+    <w:bookmarkStart w:id="23" w:name="de-dónde-sale-la-confianza-los-4-pilares"/>
     <w:p>
       <w:pPr>
         <w:pStyle w:val="Heading2"/>
@@ -2055,8 +2090,8 @@
         </w:pict>
       </w:r>
     </w:p>
-    <w:bookmarkEnd w:id="22"/>
-    <w:bookmarkStart w:id="23" w:name="el-fail-de-dani-la-confianza-de-plástico"/>
+    <w:bookmarkEnd w:id="23"/>
+    <w:bookmarkStart w:id="24" w:name="el-fail-de-dani-la-confianza-de-plástico"/>
     <w:p>
       <w:pPr>
         <w:pStyle w:val="Heading2"/>
@@ -2243,8 +2278,8 @@
         <w:t xml:space="preserve">🏫 Grupo:</w:t>
       </w:r>
     </w:p>
-    <w:bookmarkEnd w:id="23"/>
-    <w:bookmarkStart w:id="24" w:name="a-por-ellos"/>
+    <w:bookmarkEnd w:id="24"/>
+    <w:bookmarkStart w:id="25" w:name="a-por-ellos"/>
     <w:p>
       <w:pPr>
         <w:pStyle w:val="Heading2"/>
@@ -2664,8 +2699,8 @@
         </w:pict>
       </w:r>
     </w:p>
-    <w:bookmarkEnd w:id="24"/>
-    <w:bookmarkStart w:id="25" w:name="X2f4af81f09b5f8d9e5d232064d95706bcf43ada"/>
+    <w:bookmarkEnd w:id="25"/>
+    <w:bookmarkStart w:id="26" w:name="X2f4af81f09b5f8d9e5d232064d95706bcf43ada"/>
     <w:p>
       <w:pPr>
         <w:pStyle w:val="Heading2"/>
@@ -2760,8 +2795,8 @@
         </w:pict>
       </w:r>
     </w:p>
-    <w:bookmarkEnd w:id="25"/>
-    <w:bookmarkStart w:id="27" w:name="soluciones-y-pistas"/>
+    <w:bookmarkEnd w:id="26"/>
+    <w:bookmarkStart w:id="28" w:name="soluciones-y-pistas"/>
     <w:p>
       <w:pPr>
         <w:pStyle w:val="Heading2"/>
@@ -2976,7 +3011,7 @@
       <w:r>
         <w:t xml:space="preserve"> </w:t>
       </w:r>
-      <w:hyperlink r:id="rId26">
+      <w:hyperlink r:id="rId27">
         <w:r>
           <w:rPr>
             <w:rStyle w:val="Hyperlink"/>
@@ -3003,7 +3038,7 @@
       <w:r>
         <w:t xml:space="preserve"> </w:t>
       </w:r>
-      <w:hyperlink r:id="rId26">
+      <w:hyperlink r:id="rId27">
         <w:r>
           <w:rPr>
             <w:rStyle w:val="Hyperlink"/>
@@ -3030,7 +3065,7 @@
       <w:r>
         <w:t xml:space="preserve"> </w:t>
       </w:r>
-      <w:hyperlink r:id="rId11">
+      <w:hyperlink r:id="rId12">
         <w:r>
           <w:rPr>
             <w:rStyle w:val="Hyperlink"/>
@@ -3039,9 +3074,9 @@
         </w:r>
       </w:hyperlink>
     </w:p>
-    <w:bookmarkEnd w:id="27"/>
     <w:bookmarkEnd w:id="28"/>
-    <w:bookmarkStart w:id="44" w:name="cómo-se-cuida"/>
+    <w:bookmarkEnd w:id="29"/>
+    <w:bookmarkStart w:id="45" w:name="cómo-se-cuida"/>
     <w:p>
       <w:pPr>
         <w:pStyle w:val="Heading1"/>
@@ -3105,7 +3140,7 @@
         </w:pict>
       </w:r>
     </w:p>
-    <w:bookmarkStart w:id="29" w:name="en-corto-1"/>
+    <w:bookmarkStart w:id="30" w:name="en-corto-1"/>
     <w:p>
       <w:pPr>
         <w:pStyle w:val="Heading2"/>
@@ -3142,8 +3177,8 @@
         </w:pict>
       </w:r>
     </w:p>
-    <w:bookmarkEnd w:id="29"/>
-    <w:bookmarkStart w:id="30" w:name="por-qué-es-un-músculo-y-no-un-regalo"/>
+    <w:bookmarkEnd w:id="30"/>
+    <w:bookmarkStart w:id="31" w:name="por-qué-es-un-músculo-y-no-un-regalo"/>
     <w:p>
       <w:pPr>
         <w:pStyle w:val="Heading2"/>
@@ -3338,8 +3373,8 @@
         </w:pict>
       </w:r>
     </w:p>
-    <w:bookmarkEnd w:id="30"/>
-    <w:bookmarkStart w:id="38" w:name="los-siete-hábitos-de-la-confianza"/>
+    <w:bookmarkEnd w:id="31"/>
+    <w:bookmarkStart w:id="39" w:name="los-siete-hábitos-de-la-confianza"/>
     <w:p>
       <w:pPr>
         <w:pStyle w:val="Heading2"/>
@@ -3369,7 +3404,7 @@
         <w:t xml:space="preserve">🏋️ Los 7 hábitos — ninguno necesita material, solo costumbre</w:t>
       </w:r>
     </w:p>
-    <w:bookmarkStart w:id="31" w:name="cámbiate-el-guion"/>
+    <w:bookmarkStart w:id="32" w:name="cámbiate-el-guion"/>
     <w:p>
       <w:pPr>
         <w:pStyle w:val="Heading3"/>
@@ -3606,8 +3641,8 @@
         <w:t xml:space="preserve">“Bonito el eslogan, campeón. ¿Y la práctica cuándo llega?”</w:t>
       </w:r>
     </w:p>
-    <w:bookmarkEnd w:id="31"/>
-    <w:bookmarkStart w:id="32" w:name="el-diario-de-tres-cosas"/>
+    <w:bookmarkEnd w:id="32"/>
+    <w:bookmarkStart w:id="33" w:name="el-diario-de-tres-cosas"/>
     <w:p>
       <w:pPr>
         <w:pStyle w:val="Heading3"/>
@@ -3823,8 +3858,8 @@
         <w:t xml:space="preserve">. Repetirte frases bonitas es propaganda; el diario es documental.</w:t>
       </w:r>
     </w:p>
-    <w:bookmarkEnd w:id="32"/>
-    <w:bookmarkStart w:id="33" w:name="compara-con-tu-yo-de-hace-un-mes"/>
+    <w:bookmarkEnd w:id="33"/>
+    <w:bookmarkStart w:id="34" w:name="compara-con-tu-yo-de-hace-un-mes"/>
     <w:p>
       <w:pPr>
         <w:pStyle w:val="Heading3"/>
@@ -3980,8 +4015,8 @@
         <w:t xml:space="preserve">. Misma nota, dos realidades: cambia el espejo.</w:t>
       </w:r>
     </w:p>
-    <w:bookmarkEnd w:id="33"/>
-    <w:bookmarkStart w:id="34" w:name="micro-retos-de-zona-de-confort"/>
+    <w:bookmarkEnd w:id="34"/>
+    <w:bookmarkStart w:id="35" w:name="micro-retos-de-zona-de-confort"/>
     <w:p>
       <w:pPr>
         <w:pStyle w:val="Heading3"/>
@@ -4099,8 +4134,8 @@
         <w:t xml:space="preserve">de confianza. Nadie construyó un piso de un salto.</w:t>
       </w:r>
     </w:p>
-    <w:bookmarkEnd w:id="34"/>
-    <w:bookmarkStart w:id="35" w:name="rodeate-de-quien-te-suma"/>
+    <w:bookmarkEnd w:id="35"/>
+    <w:bookmarkStart w:id="36" w:name="rodeate-de-quien-te-suma"/>
     <w:p>
       <w:pPr>
         <w:pStyle w:val="Heading3"/>
@@ -4210,8 +4245,8 @@
         <w:t xml:space="preserve">Y no hace falta bloquear a nadie: basta con pasar menos tiempo con quien te achica.</w:t>
       </w:r>
     </w:p>
-    <w:bookmarkEnd w:id="35"/>
-    <w:bookmarkStart w:id="36" w:name="dormir-moverte-comer"/>
+    <w:bookmarkEnd w:id="36"/>
+    <w:bookmarkStart w:id="37" w:name="dormir-moverte-comer"/>
     <w:p>
       <w:pPr>
         <w:pStyle w:val="Heading3"/>
@@ -4376,8 +4411,8 @@
         </w:tc>
       </w:tr>
     </w:tbl>
-    <w:bookmarkEnd w:id="36"/>
-    <w:bookmarkStart w:id="37" w:name="el-error-son-datos-no-sentencia"/>
+    <w:bookmarkEnd w:id="37"/>
+    <w:bookmarkStart w:id="38" w:name="el-error-son-datos-no-sentencia"/>
     <w:p>
       <w:pPr>
         <w:pStyle w:val="Heading3"/>
@@ -4534,9 +4569,9 @@
         <w:t xml:space="preserve">🏫 Grupo:</w:t>
       </w:r>
     </w:p>
-    <w:bookmarkEnd w:id="37"/>
     <w:bookmarkEnd w:id="38"/>
-    <w:bookmarkStart w:id="39" w:name="a-por-ellos-1"/>
+    <w:bookmarkEnd w:id="39"/>
+    <w:bookmarkStart w:id="40" w:name="a-por-ellos-1"/>
     <w:p>
       <w:pPr>
         <w:pStyle w:val="Heading2"/>
@@ -5255,8 +5290,8 @@
         </w:pict>
       </w:r>
     </w:p>
-    <w:bookmarkEnd w:id="39"/>
-    <w:bookmarkStart w:id="40" w:name="Xd2683ad7ec92eb1121e208b8c0c0a7d0b7e75c2"/>
+    <w:bookmarkEnd w:id="40"/>
+    <w:bookmarkStart w:id="41" w:name="Xd2683ad7ec92eb1121e208b8c0c0a7d0b7e75c2"/>
     <w:p>
       <w:pPr>
         <w:pStyle w:val="Heading2"/>
@@ -5362,8 +5397,8 @@
         </w:pict>
       </w:r>
     </w:p>
-    <w:bookmarkEnd w:id="40"/>
-    <w:bookmarkStart w:id="41" w:name="soluciones-y-pistas-1"/>
+    <w:bookmarkEnd w:id="41"/>
+    <w:bookmarkStart w:id="42" w:name="soluciones-y-pistas-1"/>
     <w:p>
       <w:pPr>
         <w:pStyle w:val="Heading2"/>
@@ -5556,8 +5591,8 @@
         </w:pict>
       </w:r>
     </w:p>
-    <w:bookmarkEnd w:id="41"/>
-    <w:bookmarkStart w:id="42" w:name="logros-de-la-unidad"/>
+    <w:bookmarkEnd w:id="42"/>
+    <w:bookmarkStart w:id="43" w:name="logros-de-la-unidad"/>
     <w:p>
       <w:pPr>
         <w:pStyle w:val="Heading2"/>
@@ -5714,8 +5749,8 @@
         </w:pict>
       </w:r>
     </w:p>
-    <w:bookmarkEnd w:id="42"/>
-    <w:bookmarkStart w:id="43" w:name="dudas-de-10-segundos"/>
+    <w:bookmarkEnd w:id="43"/>
+    <w:bookmarkStart w:id="44" w:name="dudas-de-10-segundos"/>
     <w:p>
       <w:pPr>
         <w:pStyle w:val="Heading2"/>
@@ -5830,7 +5865,7 @@
       <w:r>
         <w:t xml:space="preserve"> </w:t>
       </w:r>
-      <w:hyperlink r:id="rId26">
+      <w:hyperlink r:id="rId27">
         <w:r>
           <w:rPr>
             <w:rStyle w:val="Hyperlink"/>
@@ -5857,7 +5892,7 @@
       <w:r>
         <w:t xml:space="preserve"> </w:t>
       </w:r>
-      <w:hyperlink r:id="rId10">
+      <w:hyperlink r:id="rId11">
         <w:r>
           <w:rPr>
             <w:rStyle w:val="Hyperlink"/>
@@ -5884,7 +5919,7 @@
       <w:r>
         <w:t xml:space="preserve"> </w:t>
       </w:r>
-      <w:hyperlink r:id="rId12">
+      <w:hyperlink r:id="rId13">
         <w:r>
           <w:rPr>
             <w:rStyle w:val="Hyperlink"/>
@@ -5893,9 +5928,9 @@
         </w:r>
       </w:hyperlink>
     </w:p>
-    <w:bookmarkEnd w:id="43"/>
     <w:bookmarkEnd w:id="44"/>
-    <w:bookmarkStart w:id="53" w:name="juegos-y-retos"/>
+    <w:bookmarkEnd w:id="45"/>
+    <w:bookmarkStart w:id="54" w:name="juegos-y-retos"/>
     <w:p>
       <w:pPr>
         <w:pStyle w:val="Heading1"/>
@@ -5959,7 +5994,7 @@
         </w:pict>
       </w:r>
     </w:p>
-    <w:bookmarkStart w:id="45" w:name="en-corto-2"/>
+    <w:bookmarkStart w:id="46" w:name="en-corto-2"/>
     <w:p>
       <w:pPr>
         <w:pStyle w:val="Heading2"/>
@@ -5996,8 +6031,8 @@
         </w:pict>
       </w:r>
     </w:p>
-    <w:bookmarkEnd w:id="45"/>
-    <w:bookmarkStart w:id="46" w:name="el-fail-de-dani-la-comparación-infinita"/>
+    <w:bookmarkEnd w:id="46"/>
+    <w:bookmarkStart w:id="47" w:name="el-fail-de-dani-la-comparación-infinita"/>
     <w:p>
       <w:pPr>
         <w:pStyle w:val="Heading2"/>
@@ -6234,8 +6269,8 @@
         </w:pict>
       </w:r>
     </w:p>
-    <w:bookmarkEnd w:id="46"/>
-    <w:bookmarkStart w:id="47" w:name="Xc080458cf17718a88a20d1b39d4453faedeed3b"/>
+    <w:bookmarkEnd w:id="47"/>
+    <w:bookmarkStart w:id="48" w:name="Xc080458cf17718a88a20d1b39d4453faedeed3b"/>
     <w:p>
       <w:pPr>
         <w:pStyle w:val="Heading2"/>
@@ -6486,8 +6521,8 @@
         </w:pict>
       </w:r>
     </w:p>
-    <w:bookmarkEnd w:id="47"/>
-    <w:bookmarkStart w:id="48" w:name="la-dinámica-estrella-post-it-sorpresa"/>
+    <w:bookmarkEnd w:id="48"/>
+    <w:bookmarkStart w:id="49" w:name="la-dinámica-estrella-post-it-sorpresa"/>
     <w:p>
       <w:pPr>
         <w:pStyle w:val="Heading2"/>
@@ -6812,8 +6847,8 @@
         <w:t xml:space="preserve">🏫 Grupo:</w:t>
       </w:r>
     </w:p>
-    <w:bookmarkEnd w:id="48"/>
-    <w:bookmarkStart w:id="49" w:name="reto-mental"/>
+    <w:bookmarkEnd w:id="49"/>
+    <w:bookmarkStart w:id="50" w:name="reto-mental"/>
     <w:p>
       <w:pPr>
         <w:pStyle w:val="Heading2"/>
@@ -7032,8 +7067,8 @@
         </w:pict>
       </w:r>
     </w:p>
-    <w:bookmarkEnd w:id="49"/>
-    <w:bookmarkStart w:id="50" w:name="logros-de-la-unidad-1"/>
+    <w:bookmarkEnd w:id="50"/>
+    <w:bookmarkStart w:id="51" w:name="logros-de-la-unidad-1"/>
     <w:p>
       <w:pPr>
         <w:pStyle w:val="Heading2"/>
@@ -7236,8 +7271,8 @@
         </w:pict>
       </w:r>
     </w:p>
-    <w:bookmarkEnd w:id="50"/>
-    <w:bookmarkStart w:id="51" w:name="dudas-de-10-segundos-1"/>
+    <w:bookmarkEnd w:id="51"/>
+    <w:bookmarkStart w:id="52" w:name="dudas-de-10-segundos-1"/>
     <w:p>
       <w:pPr>
         <w:pStyle w:val="Heading2"/>
@@ -7373,8 +7408,8 @@
         </w:pict>
       </w:r>
     </w:p>
-    <w:bookmarkEnd w:id="51"/>
-    <w:bookmarkStart w:id="52" w:name="poscréditos"/>
+    <w:bookmarkEnd w:id="52"/>
+    <w:bookmarkStart w:id="53" w:name="poscréditos"/>
     <w:p>
       <w:pPr>
         <w:pStyle w:val="Heading2"/>
@@ -7454,7 +7489,7 @@
       <w:r>
         <w:t xml:space="preserve"> </w:t>
       </w:r>
-      <w:hyperlink r:id="rId26">
+      <w:hyperlink r:id="rId27">
         <w:r>
           <w:rPr>
             <w:rStyle w:val="Hyperlink"/>
@@ -7481,7 +7516,7 @@
       <w:r>
         <w:t xml:space="preserve"> </w:t>
       </w:r>
-      <w:hyperlink r:id="rId11">
+      <w:hyperlink r:id="rId12">
         <w:r>
           <w:rPr>
             <w:rStyle w:val="Hyperlink"/>
@@ -7508,7 +7543,7 @@
       <w:r>
         <w:t xml:space="preserve"> </w:t>
       </w:r>
-      <w:hyperlink r:id="rId15">
+      <w:hyperlink r:id="rId16">
         <w:r>
           <w:rPr>
             <w:rStyle w:val="Hyperlink"/>
@@ -7517,8 +7552,8 @@
         </w:r>
       </w:hyperlink>
     </w:p>
-    <w:bookmarkEnd w:id="52"/>
     <w:bookmarkEnd w:id="53"/>
+    <w:bookmarkEnd w:id="54"/>
     <w:sectPr>
       <w:footnotePr>
         <w:numRestart w:val="eachSect"/>

</xml_diff>

<commit_message>
fix: los DOCX incrustan ahora los diagramas — bloque ficha-img convertido a markdown con PNG (Word no admite SVG), tamaño 14,8 cm en A4 y figcaption como pie
</commit_message>
<xml_diff>
--- a/docx/01-confianza-real/01-confianza-real.docx
+++ b/docx/01-confianza-real/01-confianza-real.docx
@@ -613,7 +613,7 @@
     </w:p>
     <w:bookmarkEnd w:id="17"/>
     <w:bookmarkEnd w:id="18"/>
-    <w:bookmarkStart w:id="29" w:name="qué-es-la-confianza-real"/>
+    <w:bookmarkStart w:id="32" w:name="qué-es-la-confianza-real"/>
     <w:p>
       <w:pPr>
         <w:pStyle w:val="Heading1"/>
@@ -731,7 +731,7 @@
       </w:r>
     </w:p>
     <w:bookmarkEnd w:id="19"/>
-    <w:bookmarkStart w:id="20" w:name="los-tres-personajes-del-espejo"/>
+    <w:bookmarkStart w:id="23" w:name="los-tres-personajes-del-espejo"/>
     <w:p>
       <w:pPr>
         <w:pStyle w:val="Heading2"/>
@@ -787,12 +787,54 @@
     </w:p>
     <w:p>
       <w:pPr>
-        <w:pStyle w:val="BodyText"/>
-      </w:pPr>
-    </w:p>
-    <w:p>
-      <w:pPr>
-        <w:pStyle w:val="BodyText"/>
+        <w:pStyle w:val="CaptionedFigure"/>
+      </w:pPr>
+      <w:r>
+        <w:drawing>
+          <wp:inline>
+            <wp:extent cx="5334000" cy="2453640"/>
+            <wp:effectExtent b="0" l="0" r="0" t="0"/>
+            <wp:docPr descr="🪞 Los tres personajes del espejo — el de la derecha es la meta" title="" id="21" name="Picture"/>
+            <a:graphic>
+              <a:graphicData uri="http://schemas.openxmlformats.org/drawingml/2006/picture">
+                <pic:pic>
+                  <pic:nvPicPr>
+                    <pic:cNvPr descr="public/img/01-confianza-real/01-personajes-espejo.png" id="22" name="Picture"/>
+                    <pic:cNvPicPr>
+                      <a:picLocks noChangeArrowheads="1" noChangeAspect="1"/>
+                    </pic:cNvPicPr>
+                  </pic:nvPicPr>
+                  <pic:blipFill>
+                    <a:blip r:embed="rId20"/>
+                    <a:stretch>
+                      <a:fillRect/>
+                    </a:stretch>
+                  </pic:blipFill>
+                  <pic:spPr bwMode="auto">
+                    <a:xfrm>
+                      <a:off x="0" y="0"/>
+                      <a:ext cx="5334000" cy="2453640"/>
+                    </a:xfrm>
+                    <a:prstGeom prst="rect">
+                      <a:avLst/>
+                    </a:prstGeom>
+                    <a:noFill/>
+                    <a:ln w="9525">
+                      <a:noFill/>
+                      <a:headEnd/>
+                      <a:tailEnd/>
+                    </a:ln>
+                  </pic:spPr>
+                </pic:pic>
+              </a:graphicData>
+            </a:graphic>
+          </wp:inline>
+        </w:drawing>
+      </w:r>
+    </w:p>
+    <w:p>
+      <w:pPr>
+        <w:pStyle w:val="ImageCaption"/>
       </w:pPr>
       <w:r>
         <w:t xml:space="preserve">🪞 Los tres personajes del espejo — el de la derecha es la meta</w:t>
@@ -1150,8 +1192,8 @@
         </w:pict>
       </w:r>
     </w:p>
-    <w:bookmarkEnd w:id="20"/>
-    <w:bookmarkStart w:id="21" w:name="la-autocharla-la-voz-que-te-sabotea"/>
+    <w:bookmarkEnd w:id="23"/>
+    <w:bookmarkStart w:id="24" w:name="la-autocharla-la-voz-que-te-sabotea"/>
     <w:p>
       <w:pPr>
         <w:pStyle w:val="Heading2"/>
@@ -1596,8 +1638,8 @@
         </w:pict>
       </w:r>
     </w:p>
-    <w:bookmarkEnd w:id="21"/>
-    <w:bookmarkStart w:id="22" w:name="el-making-of-vs-el-tráiler"/>
+    <w:bookmarkEnd w:id="24"/>
+    <w:bookmarkStart w:id="25" w:name="el-making-of-vs-el-tráiler"/>
     <w:p>
       <w:pPr>
         <w:pStyle w:val="Heading2"/>
@@ -1776,8 +1818,8 @@
         </w:pict>
       </w:r>
     </w:p>
-    <w:bookmarkEnd w:id="22"/>
-    <w:bookmarkStart w:id="23" w:name="de-dónde-sale-la-confianza-los-4-pilares"/>
+    <w:bookmarkEnd w:id="25"/>
+    <w:bookmarkStart w:id="26" w:name="de-dónde-sale-la-confianza-los-4-pilares"/>
     <w:p>
       <w:pPr>
         <w:pStyle w:val="Heading2"/>
@@ -2090,8 +2132,8 @@
         </w:pict>
       </w:r>
     </w:p>
-    <w:bookmarkEnd w:id="23"/>
-    <w:bookmarkStart w:id="24" w:name="el-fail-de-dani-la-confianza-de-plástico"/>
+    <w:bookmarkEnd w:id="26"/>
+    <w:bookmarkStart w:id="27" w:name="el-fail-de-dani-la-confianza-de-plástico"/>
     <w:p>
       <w:pPr>
         <w:pStyle w:val="Heading2"/>
@@ -2278,8 +2320,8 @@
         <w:t xml:space="preserve">🏫 Grupo:</w:t>
       </w:r>
     </w:p>
-    <w:bookmarkEnd w:id="24"/>
-    <w:bookmarkStart w:id="25" w:name="a-por-ellos"/>
+    <w:bookmarkEnd w:id="27"/>
+    <w:bookmarkStart w:id="28" w:name="a-por-ellos"/>
     <w:p>
       <w:pPr>
         <w:pStyle w:val="Heading2"/>
@@ -2699,8 +2741,8 @@
         </w:pict>
       </w:r>
     </w:p>
-    <w:bookmarkEnd w:id="25"/>
-    <w:bookmarkStart w:id="26" w:name="X2f4af81f09b5f8d9e5d232064d95706bcf43ada"/>
+    <w:bookmarkEnd w:id="28"/>
+    <w:bookmarkStart w:id="29" w:name="X2f4af81f09b5f8d9e5d232064d95706bcf43ada"/>
     <w:p>
       <w:pPr>
         <w:pStyle w:val="Heading2"/>
@@ -2795,8 +2837,8 @@
         </w:pict>
       </w:r>
     </w:p>
-    <w:bookmarkEnd w:id="26"/>
-    <w:bookmarkStart w:id="28" w:name="soluciones-y-pistas"/>
+    <w:bookmarkEnd w:id="29"/>
+    <w:bookmarkStart w:id="31" w:name="soluciones-y-pistas"/>
     <w:p>
       <w:pPr>
         <w:pStyle w:val="Heading2"/>
@@ -3011,7 +3053,7 @@
       <w:r>
         <w:t xml:space="preserve"> </w:t>
       </w:r>
-      <w:hyperlink r:id="rId27">
+      <w:hyperlink r:id="rId30">
         <w:r>
           <w:rPr>
             <w:rStyle w:val="Hyperlink"/>
@@ -3038,7 +3080,7 @@
       <w:r>
         <w:t xml:space="preserve"> </w:t>
       </w:r>
-      <w:hyperlink r:id="rId27">
+      <w:hyperlink r:id="rId30">
         <w:r>
           <w:rPr>
             <w:rStyle w:val="Hyperlink"/>
@@ -3074,9 +3116,9 @@
         </w:r>
       </w:hyperlink>
     </w:p>
-    <w:bookmarkEnd w:id="28"/>
-    <w:bookmarkEnd w:id="29"/>
-    <w:bookmarkStart w:id="45" w:name="cómo-se-cuida"/>
+    <w:bookmarkEnd w:id="31"/>
+    <w:bookmarkEnd w:id="32"/>
+    <w:bookmarkStart w:id="51" w:name="cómo-se-cuida"/>
     <w:p>
       <w:pPr>
         <w:pStyle w:val="Heading1"/>
@@ -3140,7 +3182,7 @@
         </w:pict>
       </w:r>
     </w:p>
-    <w:bookmarkStart w:id="30" w:name="en-corto-1"/>
+    <w:bookmarkStart w:id="33" w:name="en-corto-1"/>
     <w:p>
       <w:pPr>
         <w:pStyle w:val="Heading2"/>
@@ -3177,8 +3219,8 @@
         </w:pict>
       </w:r>
     </w:p>
-    <w:bookmarkEnd w:id="30"/>
-    <w:bookmarkStart w:id="31" w:name="por-qué-es-un-músculo-y-no-un-regalo"/>
+    <w:bookmarkEnd w:id="33"/>
+    <w:bookmarkStart w:id="34" w:name="por-qué-es-un-músculo-y-no-un-regalo"/>
     <w:p>
       <w:pPr>
         <w:pStyle w:val="Heading2"/>
@@ -3373,8 +3415,8 @@
         </w:pict>
       </w:r>
     </w:p>
-    <w:bookmarkEnd w:id="31"/>
-    <w:bookmarkStart w:id="39" w:name="los-siete-hábitos-de-la-confianza"/>
+    <w:bookmarkEnd w:id="34"/>
+    <w:bookmarkStart w:id="45" w:name="los-siete-hábitos-de-la-confianza"/>
     <w:p>
       <w:pPr>
         <w:pStyle w:val="Heading2"/>
@@ -3393,18 +3435,60 @@
     </w:p>
     <w:p>
       <w:pPr>
-        <w:pStyle w:val="BodyText"/>
-      </w:pPr>
-    </w:p>
-    <w:p>
-      <w:pPr>
-        <w:pStyle w:val="BodyText"/>
+        <w:pStyle w:val="CaptionedFigure"/>
+      </w:pPr>
+      <w:r>
+        <w:drawing>
+          <wp:inline>
+            <wp:extent cx="5334000" cy="2346960"/>
+            <wp:effectExtent b="0" l="0" r="0" t="0"/>
+            <wp:docPr descr="🏋️ Los 7 hábitos — ninguno necesita material, solo costumbre" title="" id="36" name="Picture"/>
+            <a:graphic>
+              <a:graphicData uri="http://schemas.openxmlformats.org/drawingml/2006/picture">
+                <pic:pic>
+                  <pic:nvPicPr>
+                    <pic:cNvPr descr="public/img/01-confianza-real/02-habitos-confianza.png" id="37" name="Picture"/>
+                    <pic:cNvPicPr>
+                      <a:picLocks noChangeArrowheads="1" noChangeAspect="1"/>
+                    </pic:cNvPicPr>
+                  </pic:nvPicPr>
+                  <pic:blipFill>
+                    <a:blip r:embed="rId35"/>
+                    <a:stretch>
+                      <a:fillRect/>
+                    </a:stretch>
+                  </pic:blipFill>
+                  <pic:spPr bwMode="auto">
+                    <a:xfrm>
+                      <a:off x="0" y="0"/>
+                      <a:ext cx="5334000" cy="2346960"/>
+                    </a:xfrm>
+                    <a:prstGeom prst="rect">
+                      <a:avLst/>
+                    </a:prstGeom>
+                    <a:noFill/>
+                    <a:ln w="9525">
+                      <a:noFill/>
+                      <a:headEnd/>
+                      <a:tailEnd/>
+                    </a:ln>
+                  </pic:spPr>
+                </pic:pic>
+              </a:graphicData>
+            </a:graphic>
+          </wp:inline>
+        </w:drawing>
+      </w:r>
+    </w:p>
+    <w:p>
+      <w:pPr>
+        <w:pStyle w:val="ImageCaption"/>
       </w:pPr>
       <w:r>
         <w:t xml:space="preserve">🏋️ Los 7 hábitos — ninguno necesita material, solo costumbre</w:t>
       </w:r>
     </w:p>
-    <w:bookmarkStart w:id="32" w:name="cámbiate-el-guion"/>
+    <w:bookmarkStart w:id="38" w:name="cámbiate-el-guion"/>
     <w:p>
       <w:pPr>
         <w:pStyle w:val="Heading3"/>
@@ -3641,8 +3725,8 @@
         <w:t xml:space="preserve">“Bonito el eslogan, campeón. ¿Y la práctica cuándo llega?”</w:t>
       </w:r>
     </w:p>
-    <w:bookmarkEnd w:id="32"/>
-    <w:bookmarkStart w:id="33" w:name="el-diario-de-tres-cosas"/>
+    <w:bookmarkEnd w:id="38"/>
+    <w:bookmarkStart w:id="39" w:name="el-diario-de-tres-cosas"/>
     <w:p>
       <w:pPr>
         <w:pStyle w:val="Heading3"/>
@@ -3858,8 +3942,8 @@
         <w:t xml:space="preserve">. Repetirte frases bonitas es propaganda; el diario es documental.</w:t>
       </w:r>
     </w:p>
-    <w:bookmarkEnd w:id="33"/>
-    <w:bookmarkStart w:id="34" w:name="compara-con-tu-yo-de-hace-un-mes"/>
+    <w:bookmarkEnd w:id="39"/>
+    <w:bookmarkStart w:id="40" w:name="compara-con-tu-yo-de-hace-un-mes"/>
     <w:p>
       <w:pPr>
         <w:pStyle w:val="Heading3"/>
@@ -4015,8 +4099,8 @@
         <w:t xml:space="preserve">. Misma nota, dos realidades: cambia el espejo.</w:t>
       </w:r>
     </w:p>
-    <w:bookmarkEnd w:id="34"/>
-    <w:bookmarkStart w:id="35" w:name="micro-retos-de-zona-de-confort"/>
+    <w:bookmarkEnd w:id="40"/>
+    <w:bookmarkStart w:id="41" w:name="micro-retos-de-zona-de-confort"/>
     <w:p>
       <w:pPr>
         <w:pStyle w:val="Heading3"/>
@@ -4134,8 +4218,8 @@
         <w:t xml:space="preserve">de confianza. Nadie construyó un piso de un salto.</w:t>
       </w:r>
     </w:p>
-    <w:bookmarkEnd w:id="35"/>
-    <w:bookmarkStart w:id="36" w:name="rodeate-de-quien-te-suma"/>
+    <w:bookmarkEnd w:id="41"/>
+    <w:bookmarkStart w:id="42" w:name="rodeate-de-quien-te-suma"/>
     <w:p>
       <w:pPr>
         <w:pStyle w:val="Heading3"/>
@@ -4245,8 +4329,8 @@
         <w:t xml:space="preserve">Y no hace falta bloquear a nadie: basta con pasar menos tiempo con quien te achica.</w:t>
       </w:r>
     </w:p>
-    <w:bookmarkEnd w:id="36"/>
-    <w:bookmarkStart w:id="37" w:name="dormir-moverte-comer"/>
+    <w:bookmarkEnd w:id="42"/>
+    <w:bookmarkStart w:id="43" w:name="dormir-moverte-comer"/>
     <w:p>
       <w:pPr>
         <w:pStyle w:val="Heading3"/>
@@ -4411,8 +4495,8 @@
         </w:tc>
       </w:tr>
     </w:tbl>
-    <w:bookmarkEnd w:id="37"/>
-    <w:bookmarkStart w:id="38" w:name="el-error-son-datos-no-sentencia"/>
+    <w:bookmarkEnd w:id="43"/>
+    <w:bookmarkStart w:id="44" w:name="el-error-son-datos-no-sentencia"/>
     <w:p>
       <w:pPr>
         <w:pStyle w:val="Heading3"/>
@@ -4569,9 +4653,9 @@
         <w:t xml:space="preserve">🏫 Grupo:</w:t>
       </w:r>
     </w:p>
-    <w:bookmarkEnd w:id="38"/>
-    <w:bookmarkEnd w:id="39"/>
-    <w:bookmarkStart w:id="40" w:name="a-por-ellos-1"/>
+    <w:bookmarkEnd w:id="44"/>
+    <w:bookmarkEnd w:id="45"/>
+    <w:bookmarkStart w:id="46" w:name="a-por-ellos-1"/>
     <w:p>
       <w:pPr>
         <w:pStyle w:val="Heading2"/>
@@ -5290,8 +5374,8 @@
         </w:pict>
       </w:r>
     </w:p>
-    <w:bookmarkEnd w:id="40"/>
-    <w:bookmarkStart w:id="41" w:name="Xd2683ad7ec92eb1121e208b8c0c0a7d0b7e75c2"/>
+    <w:bookmarkEnd w:id="46"/>
+    <w:bookmarkStart w:id="47" w:name="Xd2683ad7ec92eb1121e208b8c0c0a7d0b7e75c2"/>
     <w:p>
       <w:pPr>
         <w:pStyle w:val="Heading2"/>
@@ -5397,8 +5481,8 @@
         </w:pict>
       </w:r>
     </w:p>
-    <w:bookmarkEnd w:id="41"/>
-    <w:bookmarkStart w:id="42" w:name="soluciones-y-pistas-1"/>
+    <w:bookmarkEnd w:id="47"/>
+    <w:bookmarkStart w:id="48" w:name="soluciones-y-pistas-1"/>
     <w:p>
       <w:pPr>
         <w:pStyle w:val="Heading2"/>
@@ -5591,8 +5675,8 @@
         </w:pict>
       </w:r>
     </w:p>
-    <w:bookmarkEnd w:id="42"/>
-    <w:bookmarkStart w:id="43" w:name="logros-de-la-unidad"/>
+    <w:bookmarkEnd w:id="48"/>
+    <w:bookmarkStart w:id="49" w:name="logros-de-la-unidad"/>
     <w:p>
       <w:pPr>
         <w:pStyle w:val="Heading2"/>
@@ -5749,8 +5833,8 @@
         </w:pict>
       </w:r>
     </w:p>
-    <w:bookmarkEnd w:id="43"/>
-    <w:bookmarkStart w:id="44" w:name="dudas-de-10-segundos"/>
+    <w:bookmarkEnd w:id="49"/>
+    <w:bookmarkStart w:id="50" w:name="dudas-de-10-segundos"/>
     <w:p>
       <w:pPr>
         <w:pStyle w:val="Heading2"/>
@@ -5865,7 +5949,7 @@
       <w:r>
         <w:t xml:space="preserve"> </w:t>
       </w:r>
-      <w:hyperlink r:id="rId27">
+      <w:hyperlink r:id="rId30">
         <w:r>
           <w:rPr>
             <w:rStyle w:val="Hyperlink"/>
@@ -5928,9 +6012,9 @@
         </w:r>
       </w:hyperlink>
     </w:p>
-    <w:bookmarkEnd w:id="44"/>
-    <w:bookmarkEnd w:id="45"/>
-    <w:bookmarkStart w:id="54" w:name="juegos-y-retos"/>
+    <w:bookmarkEnd w:id="50"/>
+    <w:bookmarkEnd w:id="51"/>
+    <w:bookmarkStart w:id="63" w:name="juegos-y-retos"/>
     <w:p>
       <w:pPr>
         <w:pStyle w:val="Heading1"/>
@@ -5994,7 +6078,7 @@
         </w:pict>
       </w:r>
     </w:p>
-    <w:bookmarkStart w:id="46" w:name="en-corto-2"/>
+    <w:bookmarkStart w:id="52" w:name="en-corto-2"/>
     <w:p>
       <w:pPr>
         <w:pStyle w:val="Heading2"/>
@@ -6031,8 +6115,8 @@
         </w:pict>
       </w:r>
     </w:p>
-    <w:bookmarkEnd w:id="46"/>
-    <w:bookmarkStart w:id="47" w:name="el-fail-de-dani-la-comparación-infinita"/>
+    <w:bookmarkEnd w:id="52"/>
+    <w:bookmarkStart w:id="53" w:name="el-fail-de-dani-la-comparación-infinita"/>
     <w:p>
       <w:pPr>
         <w:pStyle w:val="Heading2"/>
@@ -6269,8 +6353,8 @@
         </w:pict>
       </w:r>
     </w:p>
-    <w:bookmarkEnd w:id="47"/>
-    <w:bookmarkStart w:id="48" w:name="Xc080458cf17718a88a20d1b39d4453faedeed3b"/>
+    <w:bookmarkEnd w:id="53"/>
+    <w:bookmarkStart w:id="54" w:name="Xc080458cf17718a88a20d1b39d4453faedeed3b"/>
     <w:p>
       <w:pPr>
         <w:pStyle w:val="Heading2"/>
@@ -6521,8 +6605,8 @@
         </w:pict>
       </w:r>
     </w:p>
-    <w:bookmarkEnd w:id="48"/>
-    <w:bookmarkStart w:id="49" w:name="la-dinámica-estrella-post-it-sorpresa"/>
+    <w:bookmarkEnd w:id="54"/>
+    <w:bookmarkStart w:id="58" w:name="la-dinámica-estrella-post-it-sorpresa"/>
     <w:p>
       <w:pPr>
         <w:pStyle w:val="Heading2"/>
@@ -6541,12 +6625,54 @@
     </w:p>
     <w:p>
       <w:pPr>
-        <w:pStyle w:val="BodyText"/>
-      </w:pPr>
-    </w:p>
-    <w:p>
-      <w:pPr>
-        <w:pStyle w:val="BodyText"/>
+        <w:pStyle w:val="CaptionedFigure"/>
+      </w:pPr>
+      <w:r>
+        <w:drawing>
+          <wp:inline>
+            <wp:extent cx="5334000" cy="1991360"/>
+            <wp:effectExtent b="0" l="0" r="0" t="0"/>
+            <wp:docPr descr="💌 Los 5 pasos del Post-it sorpresa" title="" id="56" name="Picture"/>
+            <a:graphic>
+              <a:graphicData uri="http://schemas.openxmlformats.org/drawingml/2006/picture">
+                <pic:pic>
+                  <pic:nvPicPr>
+                    <pic:cNvPr descr="public/img/01-confianza-real/03-post-it-sorpresa.png" id="57" name="Picture"/>
+                    <pic:cNvPicPr>
+                      <a:picLocks noChangeArrowheads="1" noChangeAspect="1"/>
+                    </pic:cNvPicPr>
+                  </pic:nvPicPr>
+                  <pic:blipFill>
+                    <a:blip r:embed="rId55"/>
+                    <a:stretch>
+                      <a:fillRect/>
+                    </a:stretch>
+                  </pic:blipFill>
+                  <pic:spPr bwMode="auto">
+                    <a:xfrm>
+                      <a:off x="0" y="0"/>
+                      <a:ext cx="5334000" cy="1991360"/>
+                    </a:xfrm>
+                    <a:prstGeom prst="rect">
+                      <a:avLst/>
+                    </a:prstGeom>
+                    <a:noFill/>
+                    <a:ln w="9525">
+                      <a:noFill/>
+                      <a:headEnd/>
+                      <a:tailEnd/>
+                    </a:ln>
+                  </pic:spPr>
+                </pic:pic>
+              </a:graphicData>
+            </a:graphic>
+          </wp:inline>
+        </w:drawing>
+      </w:r>
+    </w:p>
+    <w:p>
+      <w:pPr>
+        <w:pStyle w:val="ImageCaption"/>
       </w:pPr>
       <w:r>
         <w:t xml:space="preserve">💌 Los 5 pasos del Post-it sorpresa</w:t>
@@ -6847,8 +6973,8 @@
         <w:t xml:space="preserve">🏫 Grupo:</w:t>
       </w:r>
     </w:p>
-    <w:bookmarkEnd w:id="49"/>
-    <w:bookmarkStart w:id="50" w:name="reto-mental"/>
+    <w:bookmarkEnd w:id="58"/>
+    <w:bookmarkStart w:id="59" w:name="reto-mental"/>
     <w:p>
       <w:pPr>
         <w:pStyle w:val="Heading2"/>
@@ -7067,8 +7193,8 @@
         </w:pict>
       </w:r>
     </w:p>
-    <w:bookmarkEnd w:id="50"/>
-    <w:bookmarkStart w:id="51" w:name="logros-de-la-unidad-1"/>
+    <w:bookmarkEnd w:id="59"/>
+    <w:bookmarkStart w:id="60" w:name="logros-de-la-unidad-1"/>
     <w:p>
       <w:pPr>
         <w:pStyle w:val="Heading2"/>
@@ -7271,8 +7397,8 @@
         </w:pict>
       </w:r>
     </w:p>
-    <w:bookmarkEnd w:id="51"/>
-    <w:bookmarkStart w:id="52" w:name="dudas-de-10-segundos-1"/>
+    <w:bookmarkEnd w:id="60"/>
+    <w:bookmarkStart w:id="61" w:name="dudas-de-10-segundos-1"/>
     <w:p>
       <w:pPr>
         <w:pStyle w:val="Heading2"/>
@@ -7408,8 +7534,8 @@
         </w:pict>
       </w:r>
     </w:p>
-    <w:bookmarkEnd w:id="52"/>
-    <w:bookmarkStart w:id="53" w:name="poscréditos"/>
+    <w:bookmarkEnd w:id="61"/>
+    <w:bookmarkStart w:id="62" w:name="poscréditos"/>
     <w:p>
       <w:pPr>
         <w:pStyle w:val="Heading2"/>
@@ -7489,7 +7615,7 @@
       <w:r>
         <w:t xml:space="preserve"> </w:t>
       </w:r>
-      <w:hyperlink r:id="rId27">
+      <w:hyperlink r:id="rId30">
         <w:r>
           <w:rPr>
             <w:rStyle w:val="Hyperlink"/>
@@ -7552,8 +7678,8 @@
         </w:r>
       </w:hyperlink>
     </w:p>
-    <w:bookmarkEnd w:id="53"/>
-    <w:bookmarkEnd w:id="54"/>
+    <w:bookmarkEnd w:id="62"/>
+    <w:bookmarkEnd w:id="63"/>
     <w:sectPr>
       <w:footnotePr>
         <w:numRestart w:val="eachSect"/>

</xml_diff>